<commit_message>
Clarify participant testing instructions
</commit_message>
<xml_diff>
--- a/docs/user-testing.docx
+++ b/docs/user-testing.docx
@@ -12,7 +12,15 @@
     </w:p>
     <w:p>
       <w:r>
-        <w:t>Try the Android app in your own time, then complete this sheet. We are testing its features, not religious knowledge. Use fictional situations, not personal information.</w:t>
+        <w:rPr>
+          <w:sz w:val="18"/>
+        </w:rPr>
+        <w:t>Version 2 | Instructions clarified 20 October 2026</w:t>
+      </w:r>
+    </w:p>
+    <w:p>
+      <w:r>
+        <w:t>Try the Android app in your own time. After each task, record its result on page 2 before continuing. We are testing app features, not religious knowledge. Use fictional situations in the app and report your actual experience here.</w:t>
       </w:r>
     </w:p>
     <w:p>
@@ -58,7 +66,12 @@
     </w:p>
     <w:p>
       <w:r>
-        <w:t>Download Carry.apk and install it on your Android phone. If Android asks to allow installation from your browser or file app, allow only the supplied file. If installation is blocked, contact Eirik rather than disabling phone security. Open Carry. No account is needed.</w:t>
+        <w:t>Download Carry.apk and install it on your Android phone, then open Carry. No account is needed. If installation is blocked or you are unsure about a security prompt, stop and contact Eirik. Do not disable phone security for this test.</w:t>
+      </w:r>
+    </w:p>
+    <w:p>
+      <w:r>
+        <w:t>Did Carry install and open? Yes / No. If No, describe the problem: [Type here]</w:t>
       </w:r>
     </w:p>
     <w:p>
@@ -74,7 +87,11 @@
         <w:pStyle w:val="ListNumber"/>
       </w:pPr>
       <w:r>
-        <w:t>Create a Carry for a fictional difficult discussion. Choose Scripture and save it in category Practice, scheduled a few minutes ahead, with an if-then plan. Stop when it is saved.</w:t>
+        <w:t>Create and save a Carry for a fictional difficult discussion.</w:t>
+        <w:br/>
+        <w:t>Choose any Scripture passage. Create or use a category named Practice and set the situation time a few minutes ahead. Add a plan for what you will do if the situation happens (if ___, then I will ___).</w:t>
+        <w:br/>
+        <w:t>Stop when the Carry is saved.</w:t>
       </w:r>
     </w:p>
     <w:p>
@@ -82,7 +99,7 @@
         <w:pStyle w:val="ListNumber"/>
       </w:pPr>
       <w:r>
-        <w:t>Once that scheduled time has passed, imagine you paused before replying. Save a reflection on the same Carry. Stop when it is saved.</w:t>
+        <w:t>Wait until the time you set in task 1 has passed. On that same Carry, save a reflection about how the fictional discussion went. Imagine you paused before replying. Stop when the reflection is saved.</w:t>
       </w:r>
     </w:p>
     <w:p>
@@ -90,12 +107,12 @@
         <w:pStyle w:val="ListNumber"/>
       </w:pPr>
       <w:r>
-        <w:t>Begin another Carry in category Practice. Find its latest reflection. Stop when found, without saving the new Carry.</w:t>
+        <w:t>Begin creating another Carry and choose the Practice category. Find the latest reflection saved under that category (the one from task 2). Stop when you find it. Do not save this new Carry.</w:t>
       </w:r>
     </w:p>
     <w:p>
       <w:r>
-        <w:t>Complete the results after each attempt, even if unsuccessful. Reminders are not part of these tasks.</w:t>
+        <w:t>Record each result, even if unsuccessful. If installation or an earlier task prevents a later task, mark it Not attempted and explain why. Reminders are not part of these tasks.</w:t>
       </w:r>
     </w:p>
     <w:p>
@@ -108,7 +125,7 @@
     </w:p>
     <w:p>
       <w:r>
-        <w:t>Start a stopwatch after understanding the prompt. Stop when the task goal is reached. Include entering information in Carry. Exclude installation, waiting between tasks and filling in this sheet. If not timed, write NM instead of estimating. Note interruptions.</w:t>
+        <w:t>Start a stopwatch after understanding the task, when you begin using Carry. Stop when you finish or decide you cannot continue. Include entering information in Carry. Exclude installation, waiting between tasks and filling in this sheet. If not timed, write NM (not measured). Do not estimate. Note interruptions.</w:t>
       </w:r>
     </w:p>
     <w:p>
@@ -149,7 +166,7 @@
     </w:p>
     <w:p>
       <w:r>
-        <w:t>Completed: Yes, Partly, No or Not attempted. Help means assistance beyond these prompts. Time: seconds or NM if not measured.</w:t>
+        <w:t>Completed: Yes, Partly, No or Not attempted. Help: Yes or No for assistance beyond this sheet. Report any clarification below. Time: seconds or NM (not measured). Leave help and time blank for tasks not attempted.</w:t>
       </w:r>
     </w:p>
     <w:tbl>
@@ -493,7 +510,7 @@
         <w:rPr>
           <w:b/>
         </w:rPr>
-        <w:t>Any problems, help or interruptions? Give the task number, or write None.</w:t>
+        <w:t>Any problems, help, unclear instructions or interruptions? Give the task number and explain what happened, or write None.</w:t>
       </w:r>
     </w:p>
     <w:p>
@@ -512,7 +529,7 @@
         <w:rPr>
           <w:b/>
         </w:rPr>
-        <w:t>After task 1, what was your trigger and planned action?</w:t>
+        <w:t>What situation did you enter in task 1, and what did you plan to do when it happened?</w:t>
       </w:r>
     </w:p>
     <w:p>
@@ -531,7 +548,7 @@
         <w:rPr>
           <w:b/>
         </w:rPr>
-        <w:t>After task 3, summarise the reflection you found.</w:t>
+        <w:t>In task 3, what did the reflection you found say? Briefly summarise it. If you could not find it or did not attempt the task, write that.</w:t>
       </w:r>
     </w:p>
     <w:p>
@@ -550,7 +567,7 @@
         <w:rPr>
           <w:b/>
         </w:rPr>
-        <w:t>What would you change first?</w:t>
+        <w:t>What is the first thing you would improve about the app? If nothing comes to mind, write None.</w:t>
       </w:r>
     </w:p>
     <w:p>

</xml_diff>